<commit_message>
TP3 - Deploy your app
</commit_message>
<xml_diff>
--- a/avancement.docx
+++ b/avancement.docx
@@ -6,13 +6,8 @@
       <w:pPr>
         <w:pStyle w:val="Titre1"/>
       </w:pPr>
-      <w:proofErr w:type="spellStart"/>
-      <w:r>
-        <w:t>Database</w:t>
-      </w:r>
-      <w:proofErr w:type="spellEnd"/>
-      <w:r>
-        <w:t xml:space="preserve"> </w:t>
+      <w:r>
+        <w:t>Docker</w:t>
       </w:r>
     </w:p>
     <w:p>
@@ -911,6 +906,397 @@
         <w:t xml:space="preserve"> est exposé à l'extérieur via le port 80.</w:t>
       </w:r>
     </w:p>
+    <w:p>
+      <w:r>
+        <w:rPr>
+          <w:b/>
+          <w:bCs/>
+          <w:lang w:val="en-US"/>
+        </w:rPr>
+        <w:t xml:space="preserve">1-9 Document your publication commands and published images in </w:t>
+      </w:r>
+      <w:proofErr w:type="spellStart"/>
+      <w:r>
+        <w:rPr>
+          <w:b/>
+          <w:bCs/>
+          <w:lang w:val="en-US"/>
+        </w:rPr>
+        <w:t>dockerhub</w:t>
+      </w:r>
+      <w:proofErr w:type="spellEnd"/>
+      <w:r>
+        <w:rPr>
+          <w:b/>
+          <w:bCs/>
+          <w:lang w:val="en-US"/>
+        </w:rPr>
+        <w:t>.</w:t>
+      </w:r>
+      <w:r>
+        <w:rPr>
+          <w:lang w:val="en-US"/>
+        </w:rPr>
+        <w:br/>
+      </w:r>
+      <w:r>
+        <w:t>Les commandes de publication sont celles listées ci-dessus : docker login, suivi des commandes docker tag et docker push pour chacune des trois images (tp1-db, tp1-api, tp1-httpd). Une fois poussées, les images sont disponibles sur mon compte Docker Hub sous les noms VOTRE_USERNAME/tp1-db:1.0, VOTRE_USERNAME/tp1-api:1.0, et VOTRE_USERNAME/tp1-httpd:1.0.</w:t>
+      </w:r>
+    </w:p>
+    <w:p>
+      <w:r>
+        <w:rPr>
+          <w:b/>
+          <w:bCs/>
+          <w:lang w:val="en-US"/>
+        </w:rPr>
+        <w:lastRenderedPageBreak/>
+        <w:t>1-10 Why do we put our images into an online repo?</w:t>
+      </w:r>
+      <w:r>
+        <w:rPr>
+          <w:lang w:val="en-US"/>
+        </w:rPr>
+        <w:br/>
+      </w:r>
+      <w:r>
+        <w:t xml:space="preserve">Nous mettons nos images dans un registre en ligne (comme Docker Hub) pour les </w:t>
+      </w:r>
+      <w:r>
+        <w:rPr>
+          <w:b/>
+          <w:bCs/>
+        </w:rPr>
+        <w:t>partager et les distribuer facilement</w:t>
+      </w:r>
+      <w:r>
+        <w:t xml:space="preserve">. Cela permet à d'autres développeurs de récupérer exactement la même image pour travailler, ou à des systèmes d'intégration continue/déploiement continu (CI/CD) de les utiliser pour automatiser les tests et les mises en production. C'est un </w:t>
+      </w:r>
+      <w:r>
+        <w:rPr>
+          <w:b/>
+          <w:bCs/>
+        </w:rPr>
+        <w:t>emplacement centralisé, versionné et accessible</w:t>
+      </w:r>
+      <w:r>
+        <w:t xml:space="preserve"> qui découple la phase de construction de l'image de son déploiement.</w:t>
+      </w:r>
+    </w:p>
+    <w:p/>
+    <w:p>
+      <w:r>
+        <w:t xml:space="preserve">TP </w:t>
+      </w:r>
+      <w:proofErr w:type="spellStart"/>
+      <w:r>
+        <w:t>Github</w:t>
+      </w:r>
+      <w:proofErr w:type="spellEnd"/>
+      <w:r>
+        <w:t xml:space="preserve"> CLI :</w:t>
+      </w:r>
+    </w:p>
+    <w:p>
+      <w:pPr>
+        <w:rPr>
+          <w:b/>
+          <w:bCs/>
+        </w:rPr>
+      </w:pPr>
+      <w:r>
+        <w:rPr>
+          <w:b/>
+          <w:bCs/>
+        </w:rPr>
+        <w:t xml:space="preserve">2-1 : </w:t>
+      </w:r>
+      <w:proofErr w:type="spellStart"/>
+      <w:r>
+        <w:rPr>
+          <w:b/>
+          <w:bCs/>
+        </w:rPr>
+        <w:t>What</w:t>
+      </w:r>
+      <w:proofErr w:type="spellEnd"/>
+      <w:r>
+        <w:rPr>
+          <w:b/>
+          <w:bCs/>
+        </w:rPr>
+        <w:t xml:space="preserve"> are </w:t>
+      </w:r>
+      <w:proofErr w:type="spellStart"/>
+      <w:r>
+        <w:rPr>
+          <w:b/>
+          <w:bCs/>
+        </w:rPr>
+        <w:t>testcontainers</w:t>
+      </w:r>
+      <w:proofErr w:type="spellEnd"/>
+      <w:r>
+        <w:rPr>
+          <w:b/>
+          <w:bCs/>
+        </w:rPr>
+        <w:t>?</w:t>
+      </w:r>
+    </w:p>
+    <w:p>
+      <w:proofErr w:type="spellStart"/>
+      <w:r>
+        <w:rPr>
+          <w:b/>
+          <w:bCs/>
+        </w:rPr>
+        <w:t>Testcontainers</w:t>
+      </w:r>
+      <w:proofErr w:type="spellEnd"/>
+      <w:r>
+        <w:t xml:space="preserve"> est une bibliothèque Java qui permet de démarrer et de gérer des conteneurs Docker (comme une base de données PostgreSQL, un serveur web, etc.) directement depuis votre code de test. Au lieu de dépendre d'une base de données externe qui doit être installée et configurée, </w:t>
+      </w:r>
+      <w:proofErr w:type="spellStart"/>
+      <w:r>
+        <w:t>Testcontainers</w:t>
+      </w:r>
+      <w:proofErr w:type="spellEnd"/>
+      <w:r>
+        <w:t xml:space="preserve"> lance pour vous un conteneur "propre" au début des tests et le détruit automatiquement à la fin. Cela garantit que vos tests d'intégration s'exécutent toujours dans un environnement </w:t>
+      </w:r>
+      <w:r>
+        <w:rPr>
+          <w:b/>
+          <w:bCs/>
+        </w:rPr>
+        <w:t>isolé, propre et reproductible</w:t>
+      </w:r>
+      <w:r>
+        <w:t>, ce qui est idéal pour les pipelines de CI/CD où l'on ne peut pas supposer qu'un service est déjà disponible.</w:t>
+      </w:r>
+    </w:p>
+    <w:p/>
+    <w:p>
+      <w:pPr>
+        <w:rPr>
+          <w:b/>
+          <w:bCs/>
+          <w:lang w:val="en-US"/>
+        </w:rPr>
+      </w:pPr>
+      <w:r>
+        <w:rPr>
+          <w:b/>
+          <w:bCs/>
+          <w:lang w:val="en-US"/>
+        </w:rPr>
+        <w:t>2-2 : For what purpose do we need to use secured variables?</w:t>
+      </w:r>
+    </w:p>
+    <w:p>
+      <w:r>
+        <w:t xml:space="preserve">Nous utilisons des variables sécurisées (appelées "Secrets" dans GitHub) pour stocker et utiliser des informations sensibles </w:t>
+      </w:r>
+      <w:r>
+        <w:rPr>
+          <w:b/>
+          <w:bCs/>
+        </w:rPr>
+        <w:t>sans jamais les exposer en clair</w:t>
+      </w:r>
+      <w:r>
+        <w:t xml:space="preserve"> dans notre code ou dans les logs du pipeline. Il s'agit par exemple de mots de passe, de </w:t>
+      </w:r>
+      <w:proofErr w:type="spellStart"/>
+      <w:r>
+        <w:t>tokens</w:t>
+      </w:r>
+      <w:proofErr w:type="spellEnd"/>
+      <w:r>
+        <w:t xml:space="preserve"> d'accès (comme pour Docker Hub et </w:t>
+      </w:r>
+      <w:proofErr w:type="spellStart"/>
+      <w:r>
+        <w:t>SonarCloud</w:t>
+      </w:r>
+      <w:proofErr w:type="spellEnd"/>
+      <w:r>
+        <w:t>) ou de clés d'API. Si ces informations étaient écrites directement dans le fichier .</w:t>
+      </w:r>
+      <w:proofErr w:type="spellStart"/>
+      <w:r>
+        <w:t>yml</w:t>
+      </w:r>
+      <w:proofErr w:type="spellEnd"/>
+      <w:r>
+        <w:t>, n'importe qui ayant accès au code pourrait les voir et les utiliser, créant une faille de sécurité majeure. Les secrets sont chiffrés par GitHub et ne sont injectés dans l'environnement d'exécution qu'au moment nécessaire, tout en étant masqués dans les journaux d'exécution.</w:t>
+      </w:r>
+    </w:p>
+    <w:p/>
+    <w:p>
+      <w:pPr>
+        <w:rPr>
+          <w:b/>
+          <w:bCs/>
+          <w:lang w:val="en-US"/>
+        </w:rPr>
+      </w:pPr>
+      <w:r>
+        <w:rPr>
+          <w:b/>
+          <w:bCs/>
+          <w:lang w:val="en-US"/>
+        </w:rPr>
+        <w:t>2-3 : Why did we put needs: test-backend on this job?</w:t>
+      </w:r>
+    </w:p>
+    <w:p>
+      <w:r>
+        <w:t xml:space="preserve">Nous utilisons la directive </w:t>
+      </w:r>
+      <w:proofErr w:type="spellStart"/>
+      <w:r>
+        <w:t>needs</w:t>
+      </w:r>
+      <w:proofErr w:type="spellEnd"/>
+      <w:r>
+        <w:t xml:space="preserve">: test-backend pour créer une </w:t>
+      </w:r>
+      <w:r>
+        <w:rPr>
+          <w:b/>
+          <w:bCs/>
+        </w:rPr>
+        <w:t>dépendance</w:t>
+      </w:r>
+      <w:r>
+        <w:t xml:space="preserve"> entre les jobs et </w:t>
+      </w:r>
+      <w:r>
+        <w:rPr>
+          <w:b/>
+          <w:bCs/>
+        </w:rPr>
+        <w:t>imposer un ordre d'exécution</w:t>
+      </w:r>
+      <w:r>
+        <w:t xml:space="preserve">. Sans cette ligne, tous les jobs se lanceraient en parallèle. En l'ajoutant, on s'assure que le job </w:t>
+      </w:r>
+      <w:proofErr w:type="spellStart"/>
+      <w:r>
+        <w:t>build</w:t>
+      </w:r>
+      <w:proofErr w:type="spellEnd"/>
+      <w:r>
+        <w:t xml:space="preserve">-and-push-docker-image ne démarrera </w:t>
+      </w:r>
+      <w:r>
+        <w:rPr>
+          <w:b/>
+          <w:bCs/>
+        </w:rPr>
+        <w:t>que si et seulement si</w:t>
+      </w:r>
+      <w:r>
+        <w:t xml:space="preserve"> le job test-backend s'est terminé avec succès. C'est une pratique fondamentale de CI/CD qui garantit que l'on ne construit et ne publie jamais une image Docker d'une application dont les tests ont échoué.</w:t>
+      </w:r>
+    </w:p>
+    <w:p>
+      <w:pPr>
+        <w:pStyle w:val="Paragraphedeliste"/>
+        <w:numPr>
+          <w:ilvl w:val="1"/>
+          <w:numId w:val="6"/>
+        </w:numPr>
+        <w:rPr>
+          <w:b/>
+          <w:bCs/>
+          <w:lang w:val="en-US"/>
+        </w:rPr>
+      </w:pPr>
+      <w:r>
+        <w:rPr>
+          <w:b/>
+          <w:bCs/>
+          <w:lang w:val="en-US"/>
+        </w:rPr>
+        <w:lastRenderedPageBreak/>
+        <w:t>: For what purpose do we need to push docker images?</w:t>
+      </w:r>
+    </w:p>
+    <w:p>
+      <w:r>
+        <w:t xml:space="preserve">Nous poussons les images Docker vers un registre en ligne (comme Docker Hub) pour les </w:t>
+      </w:r>
+      <w:r>
+        <w:rPr>
+          <w:b/>
+          <w:bCs/>
+        </w:rPr>
+        <w:t>stocker, les versionner et les distribuer</w:t>
+      </w:r>
+      <w:r>
+        <w:t>. L'environnement de la CI qui construit l'image est éphémère et détruit après l'exécution ; sans "push", l'image serait perdue. Pousser l'image vers un registre la rend disponible pour :</w:t>
+      </w:r>
+    </w:p>
+    <w:p>
+      <w:pPr>
+        <w:pStyle w:val="Paragraphedeliste"/>
+        <w:numPr>
+          <w:ilvl w:val="0"/>
+          <w:numId w:val="3"/>
+        </w:numPr>
+      </w:pPr>
+      <w:r>
+        <w:rPr>
+          <w:b/>
+          <w:bCs/>
+        </w:rPr>
+        <w:t>Le déploiement</w:t>
+      </w:r>
+      <w:r>
+        <w:t xml:space="preserve"> : Les serveurs de production ou de test peuvent "pull" cette image pour la déployer.</w:t>
+      </w:r>
+    </w:p>
+    <w:p>
+      <w:pPr>
+        <w:pStyle w:val="Paragraphedeliste"/>
+        <w:numPr>
+          <w:ilvl w:val="0"/>
+          <w:numId w:val="3"/>
+        </w:numPr>
+      </w:pPr>
+      <w:r>
+        <w:rPr>
+          <w:b/>
+          <w:bCs/>
+        </w:rPr>
+        <w:t>La collaboration</w:t>
+      </w:r>
+      <w:r>
+        <w:t xml:space="preserve"> : D'autres développeurs peuvent récupérer l'image exacte pour travailler dans le même environnement.</w:t>
+      </w:r>
+    </w:p>
+    <w:p>
+      <w:pPr>
+        <w:pStyle w:val="Paragraphedeliste"/>
+        <w:numPr>
+          <w:ilvl w:val="0"/>
+          <w:numId w:val="3"/>
+        </w:numPr>
+      </w:pPr>
+      <w:r>
+        <w:rPr>
+          <w:b/>
+          <w:bCs/>
+        </w:rPr>
+        <w:t>L'archivage</w:t>
+      </w:r>
+      <w:r>
+        <w:t xml:space="preserve"> : Le registre conserve les différentes versions (tags) de l'image, permettant de revenir à une version précédente si nécessaire.</w:t>
+      </w:r>
+    </w:p>
     <w:p/>
     <w:sectPr>
       <w:pgSz w:w="11906" w:h="16838"/>
@@ -925,6 +1311,232 @@
 <file path=word/numbering.xml><?xml version="1.0" encoding="utf-8"?>
 <w:numbering xmlns:wpc="http://schemas.microsoft.com/office/word/2010/wordprocessingCanvas" xmlns:cx="http://schemas.microsoft.com/office/drawing/2014/chartex" xmlns:cx1="http://schemas.microsoft.com/office/drawing/2015/9/8/chartex" xmlns:cx2="http://schemas.microsoft.com/office/drawing/2015/10/21/chartex" xmlns:cx3="http://schemas.microsoft.com/office/drawing/2016/5/9/chartex" xmlns:cx4="http://schemas.microsoft.com/office/drawing/2016/5/10/chartex" xmlns:cx5="http://schemas.microsoft.com/office/drawing/2016/5/11/chartex" xmlns:cx6="http://schemas.microsoft.com/office/drawing/2016/5/12/chartex" xmlns:cx7="http://schemas.microsoft.com/office/drawing/2016/5/13/chartex" xmlns:cx8="http://schemas.microsoft.com/office/drawing/2016/5/14/chartex" xmlns:mc="http://schemas.openxmlformats.org/markup-compatibility/2006" xmlns:aink="http://schemas.microsoft.com/office/drawing/2016/ink" xmlns:am3d="http://schemas.microsoft.com/office/drawing/2017/model3d" xmlns:o="urn:schemas-microsoft-com:office:office" xmlns:oel="http://schemas.microsoft.com/office/2019/extlst" xmlns:r="http://schemas.openxmlformats.org/officeDocument/2006/relationships" xmlns:m="http://schemas.openxmlformats.org/officeDocument/2006/math" xmlns:v="urn:schemas-microsoft-com:vml" xmlns:wp14="http://schemas.microsoft.com/office/word/2010/wordprocessingDrawing" xmlns:wp="http://schemas.openxmlformats.org/drawingml/2006/wordprocessingDrawing" xmlns:w10="urn:schemas-microsoft-com:office:word" xmlns:w="http://schemas.openxmlformats.org/wordprocessingml/2006/main" xmlns:w14="http://schemas.microsoft.com/office/word/2010/wordml" xmlns:w15="http://schemas.microsoft.com/office/word/2012/wordml" xmlns:w16cex="http://schemas.microsoft.com/office/word/2018/wordml/cex" xmlns:w16cid="http://schemas.microsoft.com/office/word/2016/wordml/cid" xmlns:w16="http://schemas.microsoft.com/office/word/2018/wordml" xmlns:w16du="http://schemas.microsoft.com/office/word/2023/wordml/word16du" xmlns:w16sdtdh="http://schemas.microsoft.com/office/word/2020/wordml/sdtdatahash" xmlns:w16sdtfl="http://schemas.microsoft.com/office/word/2024/wordml/sdtformatlock" xmlns:w16se="http://schemas.microsoft.com/office/word/2015/wordml/symex" xmlns:wpg="http://schemas.microsoft.com/office/word/2010/wordprocessingGroup" xmlns:wpi="http://schemas.microsoft.com/office/word/2010/wordprocessingInk" xmlns:wne="http://schemas.microsoft.com/office/word/2006/wordml" xmlns:wps="http://schemas.microsoft.com/office/word/2010/wordprocessingShape" mc:Ignorable="w14 w15 w16se w16cid w16 w16cex w16sdtdh w16sdtfl w16du wp14">
   <w:abstractNum w:abstractNumId="0" w15:restartNumberingAfterBreak="0">
+    <w:nsid w:val="2F574C8E"/>
+    <w:multiLevelType w:val="multilevel"/>
+    <w:tmpl w:val="45D204E4"/>
+    <w:lvl w:ilvl="0">
+      <w:start w:val="2"/>
+      <w:numFmt w:val="decimal"/>
+      <w:lvlText w:val="%1"/>
+      <w:lvlJc w:val="left"/>
+      <w:pPr>
+        <w:ind w:left="360" w:hanging="360"/>
+      </w:pPr>
+      <w:rPr>
+        <w:rFonts w:hint="default"/>
+      </w:rPr>
+    </w:lvl>
+    <w:lvl w:ilvl="1">
+      <w:start w:val="4"/>
+      <w:numFmt w:val="decimal"/>
+      <w:lvlText w:val="%1-%2"/>
+      <w:lvlJc w:val="left"/>
+      <w:pPr>
+        <w:ind w:left="360" w:hanging="360"/>
+      </w:pPr>
+      <w:rPr>
+        <w:rFonts w:hint="default"/>
+      </w:rPr>
+    </w:lvl>
+    <w:lvl w:ilvl="2">
+      <w:start w:val="1"/>
+      <w:numFmt w:val="decimal"/>
+      <w:lvlText w:val="%1-%2.%3"/>
+      <w:lvlJc w:val="left"/>
+      <w:pPr>
+        <w:ind w:left="720" w:hanging="720"/>
+      </w:pPr>
+      <w:rPr>
+        <w:rFonts w:hint="default"/>
+      </w:rPr>
+    </w:lvl>
+    <w:lvl w:ilvl="3">
+      <w:start w:val="1"/>
+      <w:numFmt w:val="decimal"/>
+      <w:lvlText w:val="%1-%2.%3.%4"/>
+      <w:lvlJc w:val="left"/>
+      <w:pPr>
+        <w:ind w:left="1080" w:hanging="1080"/>
+      </w:pPr>
+      <w:rPr>
+        <w:rFonts w:hint="default"/>
+      </w:rPr>
+    </w:lvl>
+    <w:lvl w:ilvl="4">
+      <w:start w:val="1"/>
+      <w:numFmt w:val="decimal"/>
+      <w:lvlText w:val="%1-%2.%3.%4.%5"/>
+      <w:lvlJc w:val="left"/>
+      <w:pPr>
+        <w:ind w:left="1080" w:hanging="1080"/>
+      </w:pPr>
+      <w:rPr>
+        <w:rFonts w:hint="default"/>
+      </w:rPr>
+    </w:lvl>
+    <w:lvl w:ilvl="5">
+      <w:start w:val="1"/>
+      <w:numFmt w:val="decimal"/>
+      <w:lvlText w:val="%1-%2.%3.%4.%5.%6"/>
+      <w:lvlJc w:val="left"/>
+      <w:pPr>
+        <w:ind w:left="1440" w:hanging="1440"/>
+      </w:pPr>
+      <w:rPr>
+        <w:rFonts w:hint="default"/>
+      </w:rPr>
+    </w:lvl>
+    <w:lvl w:ilvl="6">
+      <w:start w:val="1"/>
+      <w:numFmt w:val="decimal"/>
+      <w:lvlText w:val="%1-%2.%3.%4.%5.%6.%7"/>
+      <w:lvlJc w:val="left"/>
+      <w:pPr>
+        <w:ind w:left="1440" w:hanging="1440"/>
+      </w:pPr>
+      <w:rPr>
+        <w:rFonts w:hint="default"/>
+      </w:rPr>
+    </w:lvl>
+    <w:lvl w:ilvl="7">
+      <w:start w:val="1"/>
+      <w:numFmt w:val="decimal"/>
+      <w:lvlText w:val="%1-%2.%3.%4.%5.%6.%7.%8"/>
+      <w:lvlJc w:val="left"/>
+      <w:pPr>
+        <w:ind w:left="1800" w:hanging="1800"/>
+      </w:pPr>
+      <w:rPr>
+        <w:rFonts w:hint="default"/>
+      </w:rPr>
+    </w:lvl>
+    <w:lvl w:ilvl="8">
+      <w:start w:val="1"/>
+      <w:numFmt w:val="decimal"/>
+      <w:lvlText w:val="%1-%2.%3.%4.%5.%6.%7.%8.%9"/>
+      <w:lvlJc w:val="left"/>
+      <w:pPr>
+        <w:ind w:left="1800" w:hanging="1800"/>
+      </w:pPr>
+      <w:rPr>
+        <w:rFonts w:hint="default"/>
+      </w:rPr>
+    </w:lvl>
+  </w:abstractNum>
+  <w:abstractNum w:abstractNumId="1" w15:restartNumberingAfterBreak="0">
+    <w:nsid w:val="4A816890"/>
+    <w:multiLevelType w:val="multilevel"/>
+    <w:tmpl w:val="4ABA1252"/>
+    <w:lvl w:ilvl="0">
+      <w:start w:val="1"/>
+      <w:numFmt w:val="decimal"/>
+      <w:lvlText w:val="%1."/>
+      <w:lvlJc w:val="left"/>
+      <w:pPr>
+        <w:tabs>
+          <w:tab w:val="num" w:pos="720"/>
+        </w:tabs>
+        <w:ind w:left="720" w:hanging="360"/>
+      </w:pPr>
+    </w:lvl>
+    <w:lvl w:ilvl="1" w:tentative="1">
+      <w:start w:val="1"/>
+      <w:numFmt w:val="decimal"/>
+      <w:lvlText w:val="%2."/>
+      <w:lvlJc w:val="left"/>
+      <w:pPr>
+        <w:tabs>
+          <w:tab w:val="num" w:pos="1440"/>
+        </w:tabs>
+        <w:ind w:left="1440" w:hanging="360"/>
+      </w:pPr>
+    </w:lvl>
+    <w:lvl w:ilvl="2" w:tentative="1">
+      <w:start w:val="1"/>
+      <w:numFmt w:val="decimal"/>
+      <w:lvlText w:val="%3."/>
+      <w:lvlJc w:val="left"/>
+      <w:pPr>
+        <w:tabs>
+          <w:tab w:val="num" w:pos="2160"/>
+        </w:tabs>
+        <w:ind w:left="2160" w:hanging="360"/>
+      </w:pPr>
+    </w:lvl>
+    <w:lvl w:ilvl="3" w:tentative="1">
+      <w:start w:val="1"/>
+      <w:numFmt w:val="decimal"/>
+      <w:lvlText w:val="%4."/>
+      <w:lvlJc w:val="left"/>
+      <w:pPr>
+        <w:tabs>
+          <w:tab w:val="num" w:pos="2880"/>
+        </w:tabs>
+        <w:ind w:left="2880" w:hanging="360"/>
+      </w:pPr>
+    </w:lvl>
+    <w:lvl w:ilvl="4" w:tentative="1">
+      <w:start w:val="1"/>
+      <w:numFmt w:val="decimal"/>
+      <w:lvlText w:val="%5."/>
+      <w:lvlJc w:val="left"/>
+      <w:pPr>
+        <w:tabs>
+          <w:tab w:val="num" w:pos="3600"/>
+        </w:tabs>
+        <w:ind w:left="3600" w:hanging="360"/>
+      </w:pPr>
+    </w:lvl>
+    <w:lvl w:ilvl="5" w:tentative="1">
+      <w:start w:val="1"/>
+      <w:numFmt w:val="decimal"/>
+      <w:lvlText w:val="%6."/>
+      <w:lvlJc w:val="left"/>
+      <w:pPr>
+        <w:tabs>
+          <w:tab w:val="num" w:pos="4320"/>
+        </w:tabs>
+        <w:ind w:left="4320" w:hanging="360"/>
+      </w:pPr>
+    </w:lvl>
+    <w:lvl w:ilvl="6" w:tentative="1">
+      <w:start w:val="1"/>
+      <w:numFmt w:val="decimal"/>
+      <w:lvlText w:val="%7."/>
+      <w:lvlJc w:val="left"/>
+      <w:pPr>
+        <w:tabs>
+          <w:tab w:val="num" w:pos="5040"/>
+        </w:tabs>
+        <w:ind w:left="5040" w:hanging="360"/>
+      </w:pPr>
+    </w:lvl>
+    <w:lvl w:ilvl="7" w:tentative="1">
+      <w:start w:val="1"/>
+      <w:numFmt w:val="decimal"/>
+      <w:lvlText w:val="%8."/>
+      <w:lvlJc w:val="left"/>
+      <w:pPr>
+        <w:tabs>
+          <w:tab w:val="num" w:pos="5760"/>
+        </w:tabs>
+        <w:ind w:left="5760" w:hanging="360"/>
+      </w:pPr>
+    </w:lvl>
+    <w:lvl w:ilvl="8" w:tentative="1">
+      <w:start w:val="1"/>
+      <w:numFmt w:val="decimal"/>
+      <w:lvlText w:val="%9."/>
+      <w:lvlJc w:val="left"/>
+      <w:pPr>
+        <w:tabs>
+          <w:tab w:val="num" w:pos="6480"/>
+        </w:tabs>
+        <w:ind w:left="6480" w:hanging="360"/>
+      </w:pPr>
+    </w:lvl>
+  </w:abstractNum>
+  <w:abstractNum w:abstractNumId="2" w15:restartNumberingAfterBreak="0">
     <w:nsid w:val="50BD1B7C"/>
     <w:multiLevelType w:val="multilevel"/>
     <w:tmpl w:val="5540F0F2"/>
@@ -1073,7 +1685,7 @@
       </w:rPr>
     </w:lvl>
   </w:abstractNum>
-  <w:abstractNum w:abstractNumId="1" w15:restartNumberingAfterBreak="0">
+  <w:abstractNum w:abstractNumId="3" w15:restartNumberingAfterBreak="0">
     <w:nsid w:val="623E37EF"/>
     <w:multiLevelType w:val="hybridMultilevel"/>
     <w:tmpl w:val="E1ECD778"/>
@@ -1186,7 +1798,7 @@
       </w:rPr>
     </w:lvl>
   </w:abstractNum>
-  <w:abstractNum w:abstractNumId="2" w15:restartNumberingAfterBreak="0">
+  <w:abstractNum w:abstractNumId="4" w15:restartNumberingAfterBreak="0">
     <w:nsid w:val="6CA13535"/>
     <w:multiLevelType w:val="multilevel"/>
     <w:tmpl w:val="C6EE2AD4"/>
@@ -1308,14 +1920,172 @@
       </w:rPr>
     </w:lvl>
   </w:abstractNum>
+  <w:abstractNum w:abstractNumId="5" w15:restartNumberingAfterBreak="0">
+    <w:nsid w:val="779F6397"/>
+    <w:multiLevelType w:val="multilevel"/>
+    <w:tmpl w:val="AD26125A"/>
+    <w:lvl w:ilvl="0">
+      <w:start w:val="1"/>
+      <w:numFmt w:val="bullet"/>
+      <w:lvlText w:val=""/>
+      <w:lvlJc w:val="left"/>
+      <w:pPr>
+        <w:tabs>
+          <w:tab w:val="num" w:pos="720"/>
+        </w:tabs>
+        <w:ind w:left="720" w:hanging="360"/>
+      </w:pPr>
+      <w:rPr>
+        <w:rFonts w:ascii="Symbol" w:hAnsi="Symbol" w:hint="default"/>
+        <w:sz w:val="20"/>
+      </w:rPr>
+    </w:lvl>
+    <w:lvl w:ilvl="1" w:tentative="1">
+      <w:start w:val="1"/>
+      <w:numFmt w:val="bullet"/>
+      <w:lvlText w:val="o"/>
+      <w:lvlJc w:val="left"/>
+      <w:pPr>
+        <w:tabs>
+          <w:tab w:val="num" w:pos="1440"/>
+        </w:tabs>
+        <w:ind w:left="1440" w:hanging="360"/>
+      </w:pPr>
+      <w:rPr>
+        <w:rFonts w:ascii="Courier New" w:hAnsi="Courier New" w:hint="default"/>
+        <w:sz w:val="20"/>
+      </w:rPr>
+    </w:lvl>
+    <w:lvl w:ilvl="2" w:tentative="1">
+      <w:start w:val="1"/>
+      <w:numFmt w:val="bullet"/>
+      <w:lvlText w:val=""/>
+      <w:lvlJc w:val="left"/>
+      <w:pPr>
+        <w:tabs>
+          <w:tab w:val="num" w:pos="2160"/>
+        </w:tabs>
+        <w:ind w:left="2160" w:hanging="360"/>
+      </w:pPr>
+      <w:rPr>
+        <w:rFonts w:ascii="Wingdings" w:hAnsi="Wingdings" w:hint="default"/>
+        <w:sz w:val="20"/>
+      </w:rPr>
+    </w:lvl>
+    <w:lvl w:ilvl="3" w:tentative="1">
+      <w:start w:val="1"/>
+      <w:numFmt w:val="bullet"/>
+      <w:lvlText w:val=""/>
+      <w:lvlJc w:val="left"/>
+      <w:pPr>
+        <w:tabs>
+          <w:tab w:val="num" w:pos="2880"/>
+        </w:tabs>
+        <w:ind w:left="2880" w:hanging="360"/>
+      </w:pPr>
+      <w:rPr>
+        <w:rFonts w:ascii="Wingdings" w:hAnsi="Wingdings" w:hint="default"/>
+        <w:sz w:val="20"/>
+      </w:rPr>
+    </w:lvl>
+    <w:lvl w:ilvl="4" w:tentative="1">
+      <w:start w:val="1"/>
+      <w:numFmt w:val="bullet"/>
+      <w:lvlText w:val=""/>
+      <w:lvlJc w:val="left"/>
+      <w:pPr>
+        <w:tabs>
+          <w:tab w:val="num" w:pos="3600"/>
+        </w:tabs>
+        <w:ind w:left="3600" w:hanging="360"/>
+      </w:pPr>
+      <w:rPr>
+        <w:rFonts w:ascii="Wingdings" w:hAnsi="Wingdings" w:hint="default"/>
+        <w:sz w:val="20"/>
+      </w:rPr>
+    </w:lvl>
+    <w:lvl w:ilvl="5" w:tentative="1">
+      <w:start w:val="1"/>
+      <w:numFmt w:val="bullet"/>
+      <w:lvlText w:val=""/>
+      <w:lvlJc w:val="left"/>
+      <w:pPr>
+        <w:tabs>
+          <w:tab w:val="num" w:pos="4320"/>
+        </w:tabs>
+        <w:ind w:left="4320" w:hanging="360"/>
+      </w:pPr>
+      <w:rPr>
+        <w:rFonts w:ascii="Wingdings" w:hAnsi="Wingdings" w:hint="default"/>
+        <w:sz w:val="20"/>
+      </w:rPr>
+    </w:lvl>
+    <w:lvl w:ilvl="6" w:tentative="1">
+      <w:start w:val="1"/>
+      <w:numFmt w:val="bullet"/>
+      <w:lvlText w:val=""/>
+      <w:lvlJc w:val="left"/>
+      <w:pPr>
+        <w:tabs>
+          <w:tab w:val="num" w:pos="5040"/>
+        </w:tabs>
+        <w:ind w:left="5040" w:hanging="360"/>
+      </w:pPr>
+      <w:rPr>
+        <w:rFonts w:ascii="Wingdings" w:hAnsi="Wingdings" w:hint="default"/>
+        <w:sz w:val="20"/>
+      </w:rPr>
+    </w:lvl>
+    <w:lvl w:ilvl="7" w:tentative="1">
+      <w:start w:val="1"/>
+      <w:numFmt w:val="bullet"/>
+      <w:lvlText w:val=""/>
+      <w:lvlJc w:val="left"/>
+      <w:pPr>
+        <w:tabs>
+          <w:tab w:val="num" w:pos="5760"/>
+        </w:tabs>
+        <w:ind w:left="5760" w:hanging="360"/>
+      </w:pPr>
+      <w:rPr>
+        <w:rFonts w:ascii="Wingdings" w:hAnsi="Wingdings" w:hint="default"/>
+        <w:sz w:val="20"/>
+      </w:rPr>
+    </w:lvl>
+    <w:lvl w:ilvl="8" w:tentative="1">
+      <w:start w:val="1"/>
+      <w:numFmt w:val="bullet"/>
+      <w:lvlText w:val=""/>
+      <w:lvlJc w:val="left"/>
+      <w:pPr>
+        <w:tabs>
+          <w:tab w:val="num" w:pos="6480"/>
+        </w:tabs>
+        <w:ind w:left="6480" w:hanging="360"/>
+      </w:pPr>
+      <w:rPr>
+        <w:rFonts w:ascii="Wingdings" w:hAnsi="Wingdings" w:hint="default"/>
+        <w:sz w:val="20"/>
+      </w:rPr>
+    </w:lvl>
+  </w:abstractNum>
   <w:num w:numId="1" w16cid:durableId="388115280">
-    <w:abstractNumId w:val="0"/>
+    <w:abstractNumId w:val="2"/>
   </w:num>
   <w:num w:numId="2" w16cid:durableId="1134248469">
-    <w:abstractNumId w:val="2"/>
+    <w:abstractNumId w:val="4"/>
   </w:num>
   <w:num w:numId="3" w16cid:durableId="453524316">
+    <w:abstractNumId w:val="3"/>
+  </w:num>
+  <w:num w:numId="4" w16cid:durableId="810826662">
+    <w:abstractNumId w:val="5"/>
+  </w:num>
+  <w:num w:numId="5" w16cid:durableId="689525242">
     <w:abstractNumId w:val="1"/>
+  </w:num>
+  <w:num w:numId="6" w16cid:durableId="1838812105">
+    <w:abstractNumId w:val="0"/>
   </w:num>
 </w:numbering>
 </file>

</xml_diff>